<commit_message>
Update statement of work document
Refresh the Statement of Work document to reflect the latest project scope and requirements.
</commit_message>
<xml_diff>
--- a/Statement of work.docx
+++ b/Statement of work.docx
@@ -4,478 +4,383 @@
   <w:body>
     <w:p>
       <w:pPr>
+        <w:pStyle w:val="Title"/>
+        <w:pBdr>
+          <w:bottom w:val="single" w:sz="8" w:space="18" w:color="4F81BD" w:themeColor="accent1"/>
+        </w:pBdr>
         <w:jc w:val="center"/>
+        <w:rPr>
+          <w:rFonts w:ascii="Times New Roman" w:hAnsi="Times New Roman" w:cs="Times New Roman"/>
+          <w:szCs w:val="48"/>
+        </w:rPr>
       </w:pPr>
       <w:r>
         <w:rPr>
-          <w:b/>
-          <w:color w:val="0E3652"/>
-          <w:sz w:val="22"/>
+          <w:rFonts w:ascii="Times New Roman" w:hAnsi="Times New Roman" w:cs="Times New Roman"/>
+          <w:szCs w:val="48"/>
         </w:rPr>
-        <w:t>UTAH STATE UNIVERSITY</w:t>
-      </w:r>
-    </w:p>
-    <w:p>
-      <w:pPr>
-        <w:pStyle w:val="Title"/>
-        <w:jc w:val="center"/>
-      </w:pPr>
-      <w:r>
         <w:t>STATEMENT OF WORK</w:t>
       </w:r>
     </w:p>
     <w:p>
       <w:pPr>
         <w:jc w:val="center"/>
+        <w:rPr>
+          <w:rFonts w:ascii="Times New Roman" w:hAnsi="Times New Roman" w:cs="Times New Roman"/>
+          <w:sz w:val="24"/>
+          <w:szCs w:val="24"/>
+        </w:rPr>
       </w:pPr>
       <w:r>
         <w:rPr>
+          <w:rFonts w:ascii="Times New Roman" w:hAnsi="Times New Roman" w:cs="Times New Roman"/>
           <w:b/>
-          <w:sz w:val="30"/>
+          <w:sz w:val="24"/>
+          <w:szCs w:val="24"/>
         </w:rPr>
-        <w:t>Baja SAE 2027 | Driver Control Systems</w:t>
+        <w:t xml:space="preserve">Baja SAE </w:t>
+      </w:r>
+      <w:r>
+        <w:rPr>
+          <w:rFonts w:ascii="Times New Roman" w:hAnsi="Times New Roman" w:cs="Times New Roman"/>
+          <w:b/>
+          <w:sz w:val="24"/>
+          <w:szCs w:val="24"/>
+        </w:rPr>
+        <w:t xml:space="preserve">- </w:t>
+      </w:r>
+      <w:r>
+        <w:rPr>
+          <w:rFonts w:ascii="Times New Roman" w:hAnsi="Times New Roman" w:cs="Times New Roman"/>
+          <w:b/>
+          <w:sz w:val="24"/>
+          <w:szCs w:val="24"/>
+        </w:rPr>
+        <w:t>Control Systems</w:t>
       </w:r>
     </w:p>
     <w:p>
+      <w:pPr>
+        <w:spacing w:line="240" w:lineRule="auto"/>
+        <w:jc w:val="center"/>
+        <w:rPr>
+          <w:rFonts w:ascii="Times New Roman" w:hAnsi="Times New Roman" w:cs="Times New Roman"/>
+          <w:sz w:val="24"/>
+          <w:szCs w:val="24"/>
+        </w:rPr>
+      </w:pPr>
       <w:r>
-        <w:t>PROJECT INFORMATION</w:t>
+        <w:rPr>
+          <w:rFonts w:ascii="Times New Roman" w:hAnsi="Times New Roman" w:cs="Times New Roman"/>
+          <w:sz w:val="24"/>
+          <w:szCs w:val="24"/>
+        </w:rPr>
+        <w:t xml:space="preserve">August 2026 – </w:t>
+      </w:r>
+      <w:r>
+        <w:rPr>
+          <w:rFonts w:ascii="Times New Roman" w:hAnsi="Times New Roman" w:cs="Times New Roman"/>
+          <w:sz w:val="24"/>
+          <w:szCs w:val="24"/>
+        </w:rPr>
+        <w:t>May</w:t>
+      </w:r>
+      <w:r>
+        <w:rPr>
+          <w:rFonts w:ascii="Times New Roman" w:hAnsi="Times New Roman" w:cs="Times New Roman"/>
+          <w:sz w:val="24"/>
+          <w:szCs w:val="24"/>
+        </w:rPr>
+        <w:t xml:space="preserve"> 2027</w:t>
+      </w:r>
+      <w:r>
+        <w:rPr>
+          <w:rFonts w:ascii="Times New Roman" w:hAnsi="Times New Roman" w:cs="Times New Roman"/>
+          <w:sz w:val="24"/>
+          <w:szCs w:val="24"/>
+        </w:rPr>
+        <w:br/>
+      </w:r>
+      <w:r>
+        <w:rPr>
+          <w:rFonts w:ascii="Times New Roman" w:hAnsi="Times New Roman" w:cs="Times New Roman"/>
+          <w:sz w:val="24"/>
+          <w:szCs w:val="24"/>
+        </w:rPr>
+        <w:t xml:space="preserve">Project Budget: </w:t>
+      </w:r>
+      <w:r>
+        <w:rPr>
+          <w:rFonts w:ascii="Times New Roman" w:hAnsi="Times New Roman" w:cs="Times New Roman"/>
+          <w:sz w:val="24"/>
+          <w:szCs w:val="24"/>
+        </w:rPr>
+        <w:t>TBD</w:t>
       </w:r>
     </w:p>
-    <w:tbl>
-      <w:tblPr>
-        <w:tblStyle w:val="TableGrid"/>
-        <w:tblW w:w="0" w:type="auto"/>
+    <w:p>
+      <w:pPr>
+        <w:spacing w:line="240" w:lineRule="auto"/>
         <w:jc w:val="center"/>
-        <w:tblLook w:val="04A0" w:firstRow="1" w:lastRow="0" w:firstColumn="1" w:lastColumn="0" w:noHBand="0" w:noVBand="1"/>
-      </w:tblPr>
-      <w:tblGrid>
-        <w:gridCol w:w="2520"/>
-        <w:gridCol w:w="7200"/>
-      </w:tblGrid>
-      <w:tr>
-        <w:trPr>
-          <w:jc w:val="center"/>
-        </w:trPr>
-        <w:tc>
-          <w:tcPr>
-            <w:tcW w:w="2520" w:type="dxa"/>
-            <w:shd w:val="clear" w:color="auto" w:fill="123B55"/>
-          </w:tcPr>
-          <w:p>
-            <w:pPr>
-              <w:spacing w:after="40"/>
-            </w:pPr>
-            <w:r>
-              <w:rPr>
-                <w:b/>
-                <w:color w:val="FFFFFF"/>
-                <w:sz w:val="16"/>
-              </w:rPr>
-              <w:t>Field</w:t>
-            </w:r>
-          </w:p>
-        </w:tc>
-        <w:tc>
-          <w:tcPr>
-            <w:tcW w:w="7200" w:type="dxa"/>
-            <w:shd w:val="clear" w:color="auto" w:fill="123B55"/>
-          </w:tcPr>
-          <w:p>
-            <w:pPr>
-              <w:spacing w:after="40"/>
-            </w:pPr>
-            <w:r>
-              <w:rPr>
-                <w:b/>
-                <w:color w:val="FFFFFF"/>
-                <w:sz w:val="16"/>
-              </w:rPr>
-              <w:t>Project information</w:t>
-            </w:r>
-          </w:p>
-        </w:tc>
-      </w:tr>
-      <w:tr>
-        <w:trPr>
-          <w:jc w:val="center"/>
-        </w:trPr>
-        <w:tc>
-          <w:tcPr>
-            <w:tcW w:w="2520" w:type="dxa"/>
-            <w:vAlign w:val="center"/>
-          </w:tcPr>
-          <w:p>
-            <w:pPr>
-              <w:spacing w:after="40"/>
-            </w:pPr>
-            <w:r>
-              <w:rPr>
-                <w:sz w:val="16"/>
-              </w:rPr>
-              <w:t>Project name</w:t>
-            </w:r>
-          </w:p>
-        </w:tc>
-        <w:tc>
-          <w:tcPr>
-            <w:tcW w:w="7200" w:type="dxa"/>
-            <w:vAlign w:val="center"/>
-          </w:tcPr>
-          <w:p>
-            <w:pPr>
-              <w:spacing w:after="40"/>
-            </w:pPr>
-            <w:r>
-              <w:rPr>
-                <w:sz w:val="16"/>
-              </w:rPr>
-              <w:t>USU Baja SAE – Driver Control Systems Optimization</w:t>
-            </w:r>
-          </w:p>
-        </w:tc>
-      </w:tr>
-      <w:tr>
-        <w:trPr>
-          <w:jc w:val="center"/>
-        </w:trPr>
-        <w:tc>
-          <w:tcPr>
-            <w:tcW w:w="2520" w:type="dxa"/>
-            <w:shd w:val="clear" w:color="auto" w:fill="EFF4F8"/>
-            <w:vAlign w:val="center"/>
-          </w:tcPr>
-          <w:p>
-            <w:pPr>
-              <w:spacing w:after="40"/>
-            </w:pPr>
-            <w:r>
-              <w:rPr>
-                <w:sz w:val="16"/>
-              </w:rPr>
-              <w:t>Period of performance</w:t>
-            </w:r>
-          </w:p>
-        </w:tc>
-        <w:tc>
-          <w:tcPr>
-            <w:tcW w:w="7200" w:type="dxa"/>
-            <w:shd w:val="clear" w:color="auto" w:fill="EFF4F8"/>
-            <w:vAlign w:val="center"/>
-          </w:tcPr>
-          <w:p>
-            <w:pPr>
-              <w:spacing w:after="40"/>
-            </w:pPr>
-            <w:r>
-              <w:rPr>
-                <w:sz w:val="16"/>
-              </w:rPr>
-              <w:t>[Confirm project start date] – April 2027; installed systems ready for vehicle testing by late March 2027 (proposed)</w:t>
-            </w:r>
-          </w:p>
-        </w:tc>
-      </w:tr>
-      <w:tr>
-        <w:trPr>
-          <w:jc w:val="center"/>
-        </w:trPr>
-        <w:tc>
-          <w:tcPr>
-            <w:tcW w:w="2520" w:type="dxa"/>
-            <w:vAlign w:val="center"/>
-          </w:tcPr>
-          <w:p>
-            <w:pPr>
-              <w:spacing w:after="40"/>
-            </w:pPr>
-            <w:r>
-              <w:rPr>
-                <w:sz w:val="16"/>
-              </w:rPr>
-              <w:t>Project budget</w:t>
-            </w:r>
-          </w:p>
-        </w:tc>
-        <w:tc>
-          <w:tcPr>
-            <w:tcW w:w="7200" w:type="dxa"/>
-            <w:vAlign w:val="center"/>
-          </w:tcPr>
-          <w:p>
-            <w:pPr>
-              <w:spacing w:after="40"/>
-            </w:pPr>
-            <w:r>
-              <w:rPr>
-                <w:sz w:val="16"/>
-              </w:rPr>
-              <w:t>[Sponsor-approved dollar amount required]</w:t>
-            </w:r>
-          </w:p>
-        </w:tc>
-      </w:tr>
-      <w:tr>
-        <w:trPr>
-          <w:jc w:val="center"/>
-        </w:trPr>
-        <w:tc>
-          <w:tcPr>
-            <w:tcW w:w="2520" w:type="dxa"/>
-            <w:shd w:val="clear" w:color="auto" w:fill="EFF4F8"/>
-            <w:vAlign w:val="center"/>
-          </w:tcPr>
-          <w:p>
-            <w:pPr>
-              <w:spacing w:after="40"/>
-            </w:pPr>
-            <w:r>
-              <w:rPr>
-                <w:sz w:val="16"/>
-              </w:rPr>
-              <w:t>Mentor name(s)</w:t>
-            </w:r>
-          </w:p>
-        </w:tc>
-        <w:tc>
-          <w:tcPr>
-            <w:tcW w:w="7200" w:type="dxa"/>
-            <w:shd w:val="clear" w:color="auto" w:fill="EFF4F8"/>
-            <w:vAlign w:val="center"/>
-          </w:tcPr>
-          <w:p>
-            <w:pPr>
-              <w:spacing w:after="40"/>
-            </w:pPr>
-            <w:r>
-              <w:rPr>
-                <w:sz w:val="16"/>
-              </w:rPr>
-              <w:t>[Enter name(s)]</w:t>
-            </w:r>
-          </w:p>
-        </w:tc>
-      </w:tr>
-      <w:tr>
-        <w:trPr>
-          <w:jc w:val="center"/>
-        </w:trPr>
-        <w:tc>
-          <w:tcPr>
-            <w:tcW w:w="2520" w:type="dxa"/>
-            <w:vAlign w:val="center"/>
-          </w:tcPr>
-          <w:p>
-            <w:pPr>
-              <w:spacing w:after="40"/>
-            </w:pPr>
-            <w:r>
-              <w:rPr>
-                <w:sz w:val="16"/>
-              </w:rPr>
-              <w:t>Mentor phone / email</w:t>
-            </w:r>
-          </w:p>
-        </w:tc>
-        <w:tc>
-          <w:tcPr>
-            <w:tcW w:w="7200" w:type="dxa"/>
-            <w:vAlign w:val="center"/>
-          </w:tcPr>
-          <w:p>
-            <w:pPr>
-              <w:spacing w:after="40"/>
-            </w:pPr>
-            <w:r>
-              <w:rPr>
-                <w:sz w:val="16"/>
-              </w:rPr>
-              <w:t>[Enter phone number(s) and email address(es)]</w:t>
-            </w:r>
-          </w:p>
-        </w:tc>
-      </w:tr>
-      <w:tr>
-        <w:trPr>
-          <w:jc w:val="center"/>
-        </w:trPr>
-        <w:tc>
-          <w:tcPr>
-            <w:tcW w:w="2520" w:type="dxa"/>
-            <w:shd w:val="clear" w:color="auto" w:fill="EFF4F8"/>
-            <w:vAlign w:val="center"/>
-          </w:tcPr>
-          <w:p>
-            <w:pPr>
-              <w:spacing w:after="40"/>
-            </w:pPr>
-            <w:r>
-              <w:rPr>
-                <w:sz w:val="16"/>
-              </w:rPr>
-              <w:t>Organization name</w:t>
-            </w:r>
-          </w:p>
-        </w:tc>
-        <w:tc>
-          <w:tcPr>
-            <w:tcW w:w="7200" w:type="dxa"/>
-            <w:shd w:val="clear" w:color="auto" w:fill="EFF4F8"/>
-            <w:vAlign w:val="center"/>
-          </w:tcPr>
-          <w:p>
-            <w:pPr>
-              <w:spacing w:after="40"/>
-            </w:pPr>
-            <w:r>
-              <w:rPr>
-                <w:sz w:val="16"/>
-              </w:rPr>
-              <w:t>Utah State University Baja SAE Team [confirm official sponsoring organization]</w:t>
-            </w:r>
-          </w:p>
-        </w:tc>
-      </w:tr>
-      <w:tr>
-        <w:trPr>
-          <w:jc w:val="center"/>
-        </w:trPr>
-        <w:tc>
-          <w:tcPr>
-            <w:tcW w:w="2520" w:type="dxa"/>
-            <w:vAlign w:val="center"/>
-          </w:tcPr>
-          <w:p>
-            <w:pPr>
-              <w:spacing w:after="40"/>
-            </w:pPr>
-            <w:r>
-              <w:rPr>
-                <w:sz w:val="16"/>
-              </w:rPr>
-              <w:t>Organization address</w:t>
-            </w:r>
-          </w:p>
-        </w:tc>
-        <w:tc>
-          <w:tcPr>
-            <w:tcW w:w="7200" w:type="dxa"/>
-            <w:vAlign w:val="center"/>
-          </w:tcPr>
-          <w:p>
-            <w:pPr>
-              <w:spacing w:after="40"/>
-            </w:pPr>
-            <w:r>
-              <w:rPr>
-                <w:sz w:val="16"/>
-              </w:rPr>
-              <w:t>[Enter official organization street address, city, state, ZIP]</w:t>
-            </w:r>
-          </w:p>
-        </w:tc>
-      </w:tr>
-      <w:tr>
-        <w:trPr>
-          <w:jc w:val="center"/>
-        </w:trPr>
-        <w:tc>
-          <w:tcPr>
-            <w:tcW w:w="2520" w:type="dxa"/>
-            <w:shd w:val="clear" w:color="auto" w:fill="EFF4F8"/>
-            <w:vAlign w:val="center"/>
-          </w:tcPr>
-          <w:p>
-            <w:pPr>
-              <w:spacing w:after="40"/>
-            </w:pPr>
-            <w:r>
-              <w:rPr>
-                <w:sz w:val="16"/>
-              </w:rPr>
-              <w:t>Document date / status</w:t>
-            </w:r>
-          </w:p>
-        </w:tc>
-        <w:tc>
-          <w:tcPr>
-            <w:tcW w:w="7200" w:type="dxa"/>
-            <w:shd w:val="clear" w:color="auto" w:fill="EFF4F8"/>
-            <w:vAlign w:val="center"/>
-          </w:tcPr>
-          <w:p>
-            <w:pPr>
-              <w:spacing w:after="40"/>
-            </w:pPr>
-            <w:r>
-              <w:rPr>
-                <w:sz w:val="16"/>
-              </w:rPr>
-              <w:t>October 8, 2026 | Draft for sponsor approval</w:t>
-            </w:r>
-          </w:p>
-        </w:tc>
-      </w:tr>
-    </w:tbl>
+        <w:rPr>
+          <w:rFonts w:ascii="Times New Roman" w:hAnsi="Times New Roman" w:cs="Times New Roman"/>
+          <w:sz w:val="24"/>
+          <w:szCs w:val="24"/>
+        </w:rPr>
+      </w:pPr>
+      <w:r>
+        <w:rPr>
+          <w:rFonts w:ascii="Times New Roman" w:hAnsi="Times New Roman" w:cs="Times New Roman"/>
+          <w:sz w:val="24"/>
+          <w:szCs w:val="24"/>
+        </w:rPr>
+        <w:t>Tysen Mar</w:t>
+      </w:r>
+      <w:r>
+        <w:rPr>
+          <w:rFonts w:ascii="Times New Roman" w:hAnsi="Times New Roman" w:cs="Times New Roman"/>
+          <w:sz w:val="24"/>
+          <w:szCs w:val="24"/>
+        </w:rPr>
+        <w:t>s</w:t>
+      </w:r>
+      <w:r>
+        <w:rPr>
+          <w:rFonts w:ascii="Times New Roman" w:hAnsi="Times New Roman" w:cs="Times New Roman"/>
+          <w:sz w:val="24"/>
+          <w:szCs w:val="24"/>
+        </w:rPr>
+        <w:t xml:space="preserve">hall – </w:t>
+      </w:r>
+      <w:hyperlink r:id="rId8" w:history="1">
+        <w:r>
+          <w:rPr>
+            <w:rStyle w:val="Hyperlink"/>
+            <w:rFonts w:ascii="Times New Roman" w:hAnsi="Times New Roman" w:cs="Times New Roman"/>
+            <w:sz w:val="24"/>
+            <w:szCs w:val="24"/>
+          </w:rPr>
+          <w:t>a02388176@usu.edu</w:t>
+        </w:r>
+      </w:hyperlink>
+    </w:p>
     <w:p>
+      <w:pPr>
+        <w:spacing w:line="240" w:lineRule="auto"/>
+        <w:jc w:val="center"/>
+        <w:rPr>
+          <w:rFonts w:ascii="Times New Roman" w:hAnsi="Times New Roman" w:cs="Times New Roman"/>
+          <w:sz w:val="24"/>
+          <w:szCs w:val="24"/>
+        </w:rPr>
+      </w:pPr>
       <w:r>
-        <w:t>Administrative details and any proposed (non-rule) performance targets require customer confirmation before final submission.</w:t>
+        <w:rPr>
+          <w:rFonts w:ascii="Times New Roman" w:hAnsi="Times New Roman" w:cs="Times New Roman"/>
+          <w:sz w:val="24"/>
+          <w:szCs w:val="24"/>
+        </w:rPr>
+        <w:t>Migue</w:t>
+      </w:r>
+      <w:r>
+        <w:rPr>
+          <w:rFonts w:ascii="Times New Roman" w:hAnsi="Times New Roman" w:cs="Times New Roman"/>
+          <w:sz w:val="24"/>
+          <w:szCs w:val="24"/>
+        </w:rPr>
+        <w:t xml:space="preserve">l Martinez – </w:t>
+      </w:r>
+      <w:hyperlink r:id="rId9" w:history="1">
+        <w:r>
+          <w:rPr>
+            <w:rStyle w:val="Hyperlink"/>
+            <w:rFonts w:ascii="Times New Roman" w:hAnsi="Times New Roman" w:cs="Times New Roman"/>
+            <w:sz w:val="24"/>
+            <w:szCs w:val="24"/>
+          </w:rPr>
+          <w:t>a02425243@usu.edu</w:t>
+        </w:r>
+      </w:hyperlink>
+    </w:p>
+    <w:p>
+      <w:pPr>
+        <w:spacing w:line="240" w:lineRule="auto"/>
+        <w:jc w:val="center"/>
+        <w:rPr>
+          <w:rFonts w:ascii="Times New Roman" w:hAnsi="Times New Roman" w:cs="Times New Roman"/>
+          <w:sz w:val="24"/>
+          <w:szCs w:val="24"/>
+        </w:rPr>
+      </w:pPr>
+      <w:r>
+        <w:rPr>
+          <w:rFonts w:ascii="Times New Roman" w:hAnsi="Times New Roman" w:cs="Times New Roman"/>
+          <w:sz w:val="24"/>
+          <w:szCs w:val="24"/>
+        </w:rPr>
+        <w:t xml:space="preserve">Josh Jackson - </w:t>
+      </w:r>
+      <w:hyperlink r:id="rId10" w:history="1">
+        <w:r>
+          <w:rPr>
+            <w:rStyle w:val="Hyperlink"/>
+            <w:rFonts w:ascii="Times New Roman" w:hAnsi="Times New Roman" w:cs="Times New Roman"/>
+            <w:sz w:val="24"/>
+            <w:szCs w:val="24"/>
+          </w:rPr>
+          <w:t>a02441839@usu.edu</w:t>
+        </w:r>
+      </w:hyperlink>
+    </w:p>
+    <w:p>
+      <w:pPr>
+        <w:spacing w:line="240" w:lineRule="auto"/>
+        <w:jc w:val="center"/>
+        <w:rPr>
+          <w:rFonts w:ascii="Times New Roman" w:hAnsi="Times New Roman" w:cs="Times New Roman"/>
+          <w:sz w:val="24"/>
+          <w:szCs w:val="24"/>
+        </w:rPr>
+      </w:pPr>
+    </w:p>
+    <w:p>
+      <w:pPr>
+        <w:spacing w:line="240" w:lineRule="auto"/>
+        <w:jc w:val="center"/>
+        <w:rPr>
+          <w:rFonts w:ascii="Times New Roman" w:hAnsi="Times New Roman" w:cs="Times New Roman"/>
+          <w:sz w:val="24"/>
+          <w:szCs w:val="24"/>
+        </w:rPr>
+      </w:pPr>
+      <w:r>
+        <w:rPr>
+          <w:rFonts w:ascii="Times New Roman" w:hAnsi="Times New Roman" w:cs="Times New Roman"/>
+          <w:sz w:val="24"/>
+          <w:szCs w:val="24"/>
+        </w:rPr>
+        <w:t>USU SAE Baja Team</w:t>
+      </w:r>
+      <w:r>
+        <w:rPr>
+          <w:rFonts w:ascii="Times New Roman" w:hAnsi="Times New Roman" w:cs="Times New Roman"/>
+          <w:sz w:val="24"/>
+          <w:szCs w:val="24"/>
+        </w:rPr>
+        <w:br w:type="page"/>
       </w:r>
     </w:p>
-    <w:p/>
-    <w:p/>
-    <w:p/>
-    <w:p/>
-    <w:p/>
-    <w:p/>
-    <w:p/>
-    <w:p/>
-    <w:p/>
-    <w:p/>
-    <w:p/>
-    <w:p/>
-    <w:p/>
-    <w:p/>
-    <w:p/>
-    <w:p/>
-    <w:p/>
-    <w:p/>
-    <w:p/>
-    <w:p/>
-    <w:p/>
+    <w:p>
+      <w:pPr>
+        <w:jc w:val="center"/>
+        <w:rPr>
+          <w:rFonts w:ascii="Times New Roman" w:hAnsi="Times New Roman" w:cs="Times New Roman"/>
+          <w:sz w:val="24"/>
+          <w:szCs w:val="24"/>
+        </w:rPr>
+      </w:pPr>
+    </w:p>
     <w:p>
       <w:pPr>
         <w:pStyle w:val="Heading1"/>
+        <w:rPr>
+          <w:rFonts w:ascii="Times New Roman" w:hAnsi="Times New Roman" w:cs="Times New Roman"/>
+          <w:sz w:val="24"/>
+          <w:szCs w:val="24"/>
+        </w:rPr>
       </w:pPr>
       <w:r>
-        <w:lastRenderedPageBreak/>
+        <w:rPr>
+          <w:rFonts w:ascii="Times New Roman" w:hAnsi="Times New Roman" w:cs="Times New Roman"/>
+          <w:sz w:val="24"/>
+          <w:szCs w:val="24"/>
+        </w:rPr>
         <w:t>1. Problem Description</w:t>
       </w:r>
     </w:p>
     <w:p>
+      <w:pPr>
+        <w:rPr>
+          <w:rFonts w:ascii="Times New Roman" w:hAnsi="Times New Roman" w:cs="Times New Roman"/>
+          <w:sz w:val="24"/>
+          <w:szCs w:val="24"/>
+        </w:rPr>
+      </w:pPr>
       <w:r>
+        <w:rPr>
+          <w:rFonts w:ascii="Times New Roman" w:hAnsi="Times New Roman" w:cs="Times New Roman"/>
+          <w:sz w:val="24"/>
+          <w:szCs w:val="24"/>
+        </w:rPr>
         <w:t>Baja SAE is an engineering design competition in which university teams design and build a single-seat, all-terrain vehicle intended to be reliable, maintainable, ergonomic, and economical. The vehicle must survive rough terrain while allowing its driver to maintain safe, effective control. The USU team seeks a top-10 finish at the annual Baja SAE competition.</w:t>
       </w:r>
     </w:p>
     <w:p>
+      <w:pPr>
+        <w:rPr>
+          <w:rFonts w:ascii="Times New Roman" w:hAnsi="Times New Roman" w:cs="Times New Roman"/>
+          <w:sz w:val="24"/>
+          <w:szCs w:val="24"/>
+        </w:rPr>
+      </w:pPr>
       <w:r>
+        <w:rPr>
+          <w:rFonts w:ascii="Times New Roman" w:hAnsi="Times New Roman" w:cs="Times New Roman"/>
+          <w:sz w:val="24"/>
+          <w:szCs w:val="24"/>
+        </w:rPr>
         <w:t>On USU’s existing Baja vehicle, driver controls have historically been implemented late in the build process and remain unrefined. The steering, throttle, braking, four-wheel-drive (4WD) engagement, and driver-to-pit communications systems have not received the same level of design optimization as other vehicle subsystems. This creates opportunities to improve usability, serviceability, mass, integration, and confidence in competition durability.</w:t>
       </w:r>
     </w:p>
     <w:p>
+      <w:pPr>
+        <w:rPr>
+          <w:rFonts w:ascii="Times New Roman" w:hAnsi="Times New Roman" w:cs="Times New Roman"/>
+          <w:sz w:val="24"/>
+          <w:szCs w:val="24"/>
+        </w:rPr>
+      </w:pPr>
       <w:r>
+        <w:rPr>
+          <w:rFonts w:ascii="Times New Roman" w:hAnsi="Times New Roman" w:cs="Times New Roman"/>
+          <w:sz w:val="24"/>
+          <w:szCs w:val="24"/>
+        </w:rPr>
         <w:t>This project will design, manufacture, install, and validate optimized driver controls: steering from the steering wheel to the steering rack; throttle from the pedal to the engine; brakes from the pedal to the calipers; 4WD engagement from the driver’s control to the engagement box; and driver-to-pit communications. Systems must integrate with the Baja vehicle, meet the applicable 2027 competition rules, withstand competition conditions, and minimize mass without compromising safety or durability. Overall vehicle placement is a team-level objective, not a guaranteed outcome of this subsystem project.</w:t>
       </w:r>
     </w:p>
     <w:p>
       <w:pPr>
         <w:pStyle w:val="Heading1"/>
+        <w:rPr>
+          <w:rFonts w:ascii="Times New Roman" w:hAnsi="Times New Roman" w:cs="Times New Roman"/>
+          <w:sz w:val="24"/>
+          <w:szCs w:val="24"/>
+        </w:rPr>
       </w:pPr>
       <w:r>
+        <w:rPr>
+          <w:rFonts w:ascii="Times New Roman" w:hAnsi="Times New Roman" w:cs="Times New Roman"/>
+          <w:sz w:val="24"/>
+          <w:szCs w:val="24"/>
+        </w:rPr>
         <w:t>2. Requirements, Constraints, and Goals</w:t>
       </w:r>
     </w:p>
     <w:p>
+      <w:pPr>
+        <w:rPr>
+          <w:rFonts w:ascii="Times New Roman" w:hAnsi="Times New Roman" w:cs="Times New Roman"/>
+          <w:sz w:val="24"/>
+          <w:szCs w:val="24"/>
+        </w:rPr>
+      </w:pPr>
       <w:r>
+        <w:rPr>
+          <w:rFonts w:ascii="Times New Roman" w:hAnsi="Times New Roman" w:cs="Times New Roman"/>
+          <w:sz w:val="24"/>
+          <w:szCs w:val="24"/>
+        </w:rPr>
         <w:t>Rule-based minimums are drawn from the 2027 Baja SAE Rules, Revision A. “N/A” is used for constraint targets and goal thresholds.</w:t>
       </w:r>
     </w:p>
@@ -503,12 +408,19 @@
           <w:p>
             <w:pPr>
               <w:spacing w:after="40"/>
+              <w:rPr>
+                <w:rFonts w:ascii="Times New Roman" w:hAnsi="Times New Roman" w:cs="Times New Roman"/>
+                <w:sz w:val="24"/>
+                <w:szCs w:val="24"/>
+              </w:rPr>
             </w:pPr>
             <w:r>
               <w:rPr>
+                <w:rFonts w:ascii="Times New Roman" w:hAnsi="Times New Roman" w:cs="Times New Roman"/>
                 <w:b/>
                 <w:color w:val="FFFFFF"/>
-                <w:sz w:val="16"/>
+                <w:sz w:val="24"/>
+                <w:szCs w:val="24"/>
               </w:rPr>
               <w:t>Requirement/Constraint/Goal</w:t>
             </w:r>
@@ -522,12 +434,19 @@
           <w:p>
             <w:pPr>
               <w:spacing w:after="40"/>
+              <w:rPr>
+                <w:rFonts w:ascii="Times New Roman" w:hAnsi="Times New Roman" w:cs="Times New Roman"/>
+                <w:sz w:val="24"/>
+                <w:szCs w:val="24"/>
+              </w:rPr>
             </w:pPr>
             <w:r>
               <w:rPr>
+                <w:rFonts w:ascii="Times New Roman" w:hAnsi="Times New Roman" w:cs="Times New Roman"/>
                 <w:b/>
                 <w:color w:val="FFFFFF"/>
-                <w:sz w:val="16"/>
+                <w:sz w:val="24"/>
+                <w:szCs w:val="24"/>
               </w:rPr>
               <w:t>Target</w:t>
             </w:r>
@@ -541,12 +460,19 @@
           <w:p>
             <w:pPr>
               <w:spacing w:after="40"/>
+              <w:rPr>
+                <w:rFonts w:ascii="Times New Roman" w:hAnsi="Times New Roman" w:cs="Times New Roman"/>
+                <w:sz w:val="24"/>
+                <w:szCs w:val="24"/>
+              </w:rPr>
             </w:pPr>
             <w:r>
               <w:rPr>
+                <w:rFonts w:ascii="Times New Roman" w:hAnsi="Times New Roman" w:cs="Times New Roman"/>
                 <w:b/>
                 <w:color w:val="FFFFFF"/>
-                <w:sz w:val="16"/>
+                <w:sz w:val="24"/>
+                <w:szCs w:val="24"/>
               </w:rPr>
               <w:t>Threshold</w:t>
             </w:r>
@@ -565,10 +491,17 @@
           <w:p>
             <w:pPr>
               <w:spacing w:after="40"/>
+              <w:rPr>
+                <w:rFonts w:ascii="Times New Roman" w:hAnsi="Times New Roman" w:cs="Times New Roman"/>
+                <w:sz w:val="24"/>
+                <w:szCs w:val="24"/>
+              </w:rPr>
             </w:pPr>
             <w:r>
               <w:rPr>
-                <w:sz w:val="16"/>
+                <w:rFonts w:ascii="Times New Roman" w:hAnsi="Times New Roman" w:cs="Times New Roman"/>
+                <w:sz w:val="24"/>
+                <w:szCs w:val="24"/>
               </w:rPr>
               <w:t>Requirement – brake-pedal structural load capacity</w:t>
             </w:r>
@@ -582,10 +515,17 @@
           <w:p>
             <w:pPr>
               <w:spacing w:after="40"/>
+              <w:rPr>
+                <w:rFonts w:ascii="Times New Roman" w:hAnsi="Times New Roman" w:cs="Times New Roman"/>
+                <w:sz w:val="24"/>
+                <w:szCs w:val="24"/>
+              </w:rPr>
             </w:pPr>
             <w:r>
               <w:rPr>
-                <w:sz w:val="16"/>
+                <w:rFonts w:ascii="Times New Roman" w:hAnsi="Times New Roman" w:cs="Times New Roman"/>
+                <w:sz w:val="24"/>
+                <w:szCs w:val="24"/>
               </w:rPr>
               <w:t>≥ 2,500 N (proposed)</w:t>
             </w:r>
@@ -599,10 +539,17 @@
           <w:p>
             <w:pPr>
               <w:spacing w:after="40"/>
+              <w:rPr>
+                <w:rFonts w:ascii="Times New Roman" w:hAnsi="Times New Roman" w:cs="Times New Roman"/>
+                <w:sz w:val="24"/>
+                <w:szCs w:val="24"/>
+              </w:rPr>
             </w:pPr>
             <w:r>
               <w:rPr>
-                <w:sz w:val="16"/>
+                <w:rFonts w:ascii="Times New Roman" w:hAnsi="Times New Roman" w:cs="Times New Roman"/>
+                <w:sz w:val="24"/>
+                <w:szCs w:val="24"/>
               </w:rPr>
               <w:t>≥ 2,000 N</w:t>
             </w:r>
@@ -622,10 +569,17 @@
           <w:p>
             <w:pPr>
               <w:spacing w:after="40"/>
+              <w:rPr>
+                <w:rFonts w:ascii="Times New Roman" w:hAnsi="Times New Roman" w:cs="Times New Roman"/>
+                <w:sz w:val="24"/>
+                <w:szCs w:val="24"/>
+              </w:rPr>
             </w:pPr>
             <w:r>
               <w:rPr>
-                <w:sz w:val="16"/>
+                <w:rFonts w:ascii="Times New Roman" w:hAnsi="Times New Roman" w:cs="Times New Roman"/>
+                <w:sz w:val="24"/>
+                <w:szCs w:val="24"/>
               </w:rPr>
               <w:t>Requirement – independent brake hydraulic circuits</w:t>
             </w:r>
@@ -640,10 +594,17 @@
           <w:p>
             <w:pPr>
               <w:spacing w:after="40"/>
+              <w:rPr>
+                <w:rFonts w:ascii="Times New Roman" w:hAnsi="Times New Roman" w:cs="Times New Roman"/>
+                <w:sz w:val="24"/>
+                <w:szCs w:val="24"/>
+              </w:rPr>
             </w:pPr>
             <w:r>
               <w:rPr>
-                <w:sz w:val="16"/>
+                <w:rFonts w:ascii="Times New Roman" w:hAnsi="Times New Roman" w:cs="Times New Roman"/>
+                <w:sz w:val="24"/>
+                <w:szCs w:val="24"/>
               </w:rPr>
               <w:t>2 circuits</w:t>
             </w:r>
@@ -658,10 +619,17 @@
           <w:p>
             <w:pPr>
               <w:spacing w:after="40"/>
+              <w:rPr>
+                <w:rFonts w:ascii="Times New Roman" w:hAnsi="Times New Roman" w:cs="Times New Roman"/>
+                <w:sz w:val="24"/>
+                <w:szCs w:val="24"/>
+              </w:rPr>
             </w:pPr>
             <w:r>
               <w:rPr>
-                <w:sz w:val="16"/>
+                <w:rFonts w:ascii="Times New Roman" w:hAnsi="Times New Roman" w:cs="Times New Roman"/>
+                <w:sz w:val="24"/>
+                <w:szCs w:val="24"/>
               </w:rPr>
               <w:t>2 circuits</w:t>
             </w:r>
@@ -680,10 +648,17 @@
           <w:p>
             <w:pPr>
               <w:spacing w:after="40"/>
+              <w:rPr>
+                <w:rFonts w:ascii="Times New Roman" w:hAnsi="Times New Roman" w:cs="Times New Roman"/>
+                <w:sz w:val="24"/>
+                <w:szCs w:val="24"/>
+              </w:rPr>
             </w:pPr>
             <w:r>
               <w:rPr>
-                <w:sz w:val="16"/>
+                <w:rFonts w:ascii="Times New Roman" w:hAnsi="Times New Roman" w:cs="Times New Roman"/>
+                <w:sz w:val="24"/>
+                <w:szCs w:val="24"/>
               </w:rPr>
               <w:t>Requirement – brake-controlled wheel coverage</w:t>
             </w:r>
@@ -697,10 +672,17 @@
           <w:p>
             <w:pPr>
               <w:spacing w:after="40"/>
+              <w:rPr>
+                <w:rFonts w:ascii="Times New Roman" w:hAnsi="Times New Roman" w:cs="Times New Roman"/>
+                <w:sz w:val="24"/>
+                <w:szCs w:val="24"/>
+              </w:rPr>
             </w:pPr>
             <w:r>
               <w:rPr>
-                <w:sz w:val="16"/>
+                <w:rFonts w:ascii="Times New Roman" w:hAnsi="Times New Roman" w:cs="Times New Roman"/>
+                <w:sz w:val="24"/>
+                <w:szCs w:val="24"/>
               </w:rPr>
               <w:t>4 wheels</w:t>
             </w:r>
@@ -714,10 +696,17 @@
           <w:p>
             <w:pPr>
               <w:spacing w:after="40"/>
+              <w:rPr>
+                <w:rFonts w:ascii="Times New Roman" w:hAnsi="Times New Roman" w:cs="Times New Roman"/>
+                <w:sz w:val="24"/>
+                <w:szCs w:val="24"/>
+              </w:rPr>
             </w:pPr>
             <w:r>
               <w:rPr>
-                <w:sz w:val="16"/>
+                <w:rFonts w:ascii="Times New Roman" w:hAnsi="Times New Roman" w:cs="Times New Roman"/>
+                <w:sz w:val="24"/>
+                <w:szCs w:val="24"/>
               </w:rPr>
               <w:t>4 wheels</w:t>
             </w:r>
@@ -737,10 +726,17 @@
           <w:p>
             <w:pPr>
               <w:spacing w:after="40"/>
+              <w:rPr>
+                <w:rFonts w:ascii="Times New Roman" w:hAnsi="Times New Roman" w:cs="Times New Roman"/>
+                <w:sz w:val="24"/>
+                <w:szCs w:val="24"/>
+              </w:rPr>
             </w:pPr>
             <w:r>
               <w:rPr>
-                <w:sz w:val="16"/>
+                <w:rFonts w:ascii="Times New Roman" w:hAnsi="Times New Roman" w:cs="Times New Roman"/>
+                <w:sz w:val="24"/>
+                <w:szCs w:val="24"/>
               </w:rPr>
               <w:t>Requirement – throttle travel from idle to full opening</w:t>
             </w:r>
@@ -755,10 +751,17 @@
           <w:p>
             <w:pPr>
               <w:spacing w:after="40"/>
+              <w:rPr>
+                <w:rFonts w:ascii="Times New Roman" w:hAnsi="Times New Roman" w:cs="Times New Roman"/>
+                <w:sz w:val="24"/>
+                <w:szCs w:val="24"/>
+              </w:rPr>
             </w:pPr>
             <w:r>
               <w:rPr>
-                <w:sz w:val="16"/>
+                <w:rFonts w:ascii="Times New Roman" w:hAnsi="Times New Roman" w:cs="Times New Roman"/>
+                <w:sz w:val="24"/>
+                <w:szCs w:val="24"/>
               </w:rPr>
               <w:t>100% throttle</w:t>
             </w:r>
@@ -773,10 +776,17 @@
           <w:p>
             <w:pPr>
               <w:spacing w:after="40"/>
+              <w:rPr>
+                <w:rFonts w:ascii="Times New Roman" w:hAnsi="Times New Roman" w:cs="Times New Roman"/>
+                <w:sz w:val="24"/>
+                <w:szCs w:val="24"/>
+              </w:rPr>
             </w:pPr>
             <w:r>
               <w:rPr>
-                <w:sz w:val="16"/>
+                <w:rFonts w:ascii="Times New Roman" w:hAnsi="Times New Roman" w:cs="Times New Roman"/>
+                <w:sz w:val="24"/>
+                <w:szCs w:val="24"/>
               </w:rPr>
               <w:t>100% throttle</w:t>
             </w:r>
@@ -795,10 +805,17 @@
           <w:p>
             <w:pPr>
               <w:spacing w:after="40"/>
+              <w:rPr>
+                <w:rFonts w:ascii="Times New Roman" w:hAnsi="Times New Roman" w:cs="Times New Roman"/>
+                <w:sz w:val="24"/>
+                <w:szCs w:val="24"/>
+              </w:rPr>
             </w:pPr>
             <w:r>
               <w:rPr>
-                <w:sz w:val="16"/>
+                <w:rFonts w:ascii="Times New Roman" w:hAnsi="Times New Roman" w:cs="Times New Roman"/>
+                <w:sz w:val="24"/>
+                <w:szCs w:val="24"/>
               </w:rPr>
               <w:t>Requirement – throttle return position upon release or control failure</w:t>
             </w:r>
@@ -812,10 +829,17 @@
           <w:p>
             <w:pPr>
               <w:spacing w:after="40"/>
+              <w:rPr>
+                <w:rFonts w:ascii="Times New Roman" w:hAnsi="Times New Roman" w:cs="Times New Roman"/>
+                <w:sz w:val="24"/>
+                <w:szCs w:val="24"/>
+              </w:rPr>
             </w:pPr>
             <w:r>
               <w:rPr>
-                <w:sz w:val="16"/>
+                <w:rFonts w:ascii="Times New Roman" w:hAnsi="Times New Roman" w:cs="Times New Roman"/>
+                <w:sz w:val="24"/>
+                <w:szCs w:val="24"/>
               </w:rPr>
               <w:t>0% throttle</w:t>
             </w:r>
@@ -829,10 +853,17 @@
           <w:p>
             <w:pPr>
               <w:spacing w:after="40"/>
+              <w:rPr>
+                <w:rFonts w:ascii="Times New Roman" w:hAnsi="Times New Roman" w:cs="Times New Roman"/>
+                <w:sz w:val="24"/>
+                <w:szCs w:val="24"/>
+              </w:rPr>
             </w:pPr>
             <w:r>
               <w:rPr>
-                <w:sz w:val="16"/>
+                <w:rFonts w:ascii="Times New Roman" w:hAnsi="Times New Roman" w:cs="Times New Roman"/>
+                <w:sz w:val="24"/>
+                <w:szCs w:val="24"/>
               </w:rPr>
               <w:t>0% throttle</w:t>
             </w:r>
@@ -852,10 +883,17 @@
           <w:p>
             <w:pPr>
               <w:spacing w:after="40"/>
+              <w:rPr>
+                <w:rFonts w:ascii="Times New Roman" w:hAnsi="Times New Roman" w:cs="Times New Roman"/>
+                <w:sz w:val="24"/>
+                <w:szCs w:val="24"/>
+              </w:rPr>
             </w:pPr>
             <w:r>
               <w:rPr>
-                <w:sz w:val="16"/>
+                <w:rFonts w:ascii="Times New Roman" w:hAnsi="Times New Roman" w:cs="Times New Roman"/>
+                <w:sz w:val="24"/>
+                <w:szCs w:val="24"/>
               </w:rPr>
               <w:t>Requirement – cockpit egress time with installed controls</w:t>
             </w:r>
@@ -870,10 +908,17 @@
           <w:p>
             <w:pPr>
               <w:spacing w:after="40"/>
+              <w:rPr>
+                <w:rFonts w:ascii="Times New Roman" w:hAnsi="Times New Roman" w:cs="Times New Roman"/>
+                <w:sz w:val="24"/>
+                <w:szCs w:val="24"/>
+              </w:rPr>
             </w:pPr>
             <w:r>
               <w:rPr>
-                <w:sz w:val="16"/>
+                <w:rFonts w:ascii="Times New Roman" w:hAnsi="Times New Roman" w:cs="Times New Roman"/>
+                <w:sz w:val="24"/>
+                <w:szCs w:val="24"/>
               </w:rPr>
               <w:t>≤ 4 s (proposed)</w:t>
             </w:r>
@@ -888,10 +933,17 @@
           <w:p>
             <w:pPr>
               <w:spacing w:after="40"/>
+              <w:rPr>
+                <w:rFonts w:ascii="Times New Roman" w:hAnsi="Times New Roman" w:cs="Times New Roman"/>
+                <w:sz w:val="24"/>
+                <w:szCs w:val="24"/>
+              </w:rPr>
             </w:pPr>
             <w:r>
               <w:rPr>
-                <w:sz w:val="16"/>
+                <w:rFonts w:ascii="Times New Roman" w:hAnsi="Times New Roman" w:cs="Times New Roman"/>
+                <w:sz w:val="24"/>
+                <w:szCs w:val="24"/>
               </w:rPr>
               <w:t>≤ 5 s</w:t>
             </w:r>
@@ -910,10 +962,17 @@
           <w:p>
             <w:pPr>
               <w:spacing w:after="40"/>
+              <w:rPr>
+                <w:rFonts w:ascii="Times New Roman" w:hAnsi="Times New Roman" w:cs="Times New Roman"/>
+                <w:sz w:val="24"/>
+                <w:szCs w:val="24"/>
+              </w:rPr>
             </w:pPr>
             <w:r>
               <w:rPr>
-                <w:sz w:val="16"/>
+                <w:rFonts w:ascii="Times New Roman" w:hAnsi="Times New Roman" w:cs="Times New Roman"/>
+                <w:sz w:val="24"/>
+                <w:szCs w:val="24"/>
               </w:rPr>
               <w:t>Requirement – steering wheel free play</w:t>
             </w:r>
@@ -927,10 +986,17 @@
           <w:p>
             <w:pPr>
               <w:spacing w:after="40"/>
+              <w:rPr>
+                <w:rFonts w:ascii="Times New Roman" w:hAnsi="Times New Roman" w:cs="Times New Roman"/>
+                <w:sz w:val="24"/>
+                <w:szCs w:val="24"/>
+              </w:rPr>
             </w:pPr>
             <w:r>
               <w:rPr>
-                <w:sz w:val="16"/>
+                <w:rFonts w:ascii="Times New Roman" w:hAnsi="Times New Roman" w:cs="Times New Roman"/>
+                <w:sz w:val="24"/>
+                <w:szCs w:val="24"/>
               </w:rPr>
               <w:t>≤ 5 mm (proposed)</w:t>
             </w:r>
@@ -944,10 +1010,17 @@
           <w:p>
             <w:pPr>
               <w:spacing w:after="40"/>
+              <w:rPr>
+                <w:rFonts w:ascii="Times New Roman" w:hAnsi="Times New Roman" w:cs="Times New Roman"/>
+                <w:sz w:val="24"/>
+                <w:szCs w:val="24"/>
+              </w:rPr>
             </w:pPr>
             <w:r>
               <w:rPr>
-                <w:sz w:val="16"/>
+                <w:rFonts w:ascii="Times New Roman" w:hAnsi="Times New Roman" w:cs="Times New Roman"/>
+                <w:sz w:val="24"/>
+                <w:szCs w:val="24"/>
               </w:rPr>
               <w:t>≤ 10 mm (proposed)</w:t>
             </w:r>
@@ -967,10 +1040,17 @@
           <w:p>
             <w:pPr>
               <w:spacing w:after="40"/>
+              <w:rPr>
+                <w:rFonts w:ascii="Times New Roman" w:hAnsi="Times New Roman" w:cs="Times New Roman"/>
+                <w:sz w:val="24"/>
+                <w:szCs w:val="24"/>
+              </w:rPr>
             </w:pPr>
             <w:r>
               <w:rPr>
-                <w:sz w:val="16"/>
+                <w:rFonts w:ascii="Times New Roman" w:hAnsi="Times New Roman" w:cs="Times New Roman"/>
+                <w:sz w:val="24"/>
+                <w:szCs w:val="24"/>
               </w:rPr>
               <w:t>Requirement – two-way radio communication range under test conditions</w:t>
             </w:r>
@@ -985,22 +1065,33 @@
           <w:p>
             <w:pPr>
               <w:spacing w:after="40"/>
+              <w:rPr>
+                <w:rFonts w:ascii="Times New Roman" w:hAnsi="Times New Roman" w:cs="Times New Roman"/>
+                <w:sz w:val="24"/>
+                <w:szCs w:val="24"/>
+              </w:rPr>
             </w:pPr>
             <w:r>
               <w:rPr>
-                <w:sz w:val="16"/>
+                <w:rFonts w:ascii="Times New Roman" w:hAnsi="Times New Roman" w:cs="Times New Roman"/>
+                <w:sz w:val="24"/>
+                <w:szCs w:val="24"/>
               </w:rPr>
               <w:t xml:space="preserve">≥ </w:t>
             </w:r>
             <w:r>
               <w:rPr>
-                <w:sz w:val="16"/>
+                <w:rFonts w:ascii="Times New Roman" w:hAnsi="Times New Roman" w:cs="Times New Roman"/>
+                <w:sz w:val="24"/>
+                <w:szCs w:val="24"/>
               </w:rPr>
               <w:t>75</w:t>
             </w:r>
             <w:r>
               <w:rPr>
-                <w:sz w:val="16"/>
+                <w:rFonts w:ascii="Times New Roman" w:hAnsi="Times New Roman" w:cs="Times New Roman"/>
+                <w:sz w:val="24"/>
+                <w:szCs w:val="24"/>
               </w:rPr>
               <w:t>0 m (proposed)</w:t>
             </w:r>
@@ -1015,22 +1106,33 @@
           <w:p>
             <w:pPr>
               <w:spacing w:after="40"/>
+              <w:rPr>
+                <w:rFonts w:ascii="Times New Roman" w:hAnsi="Times New Roman" w:cs="Times New Roman"/>
+                <w:sz w:val="24"/>
+                <w:szCs w:val="24"/>
+              </w:rPr>
             </w:pPr>
             <w:r>
               <w:rPr>
-                <w:sz w:val="16"/>
+                <w:rFonts w:ascii="Times New Roman" w:hAnsi="Times New Roman" w:cs="Times New Roman"/>
+                <w:sz w:val="24"/>
+                <w:szCs w:val="24"/>
               </w:rPr>
               <w:t xml:space="preserve">≥ </w:t>
             </w:r>
             <w:r>
               <w:rPr>
-                <w:sz w:val="16"/>
+                <w:rFonts w:ascii="Times New Roman" w:hAnsi="Times New Roman" w:cs="Times New Roman"/>
+                <w:sz w:val="24"/>
+                <w:szCs w:val="24"/>
               </w:rPr>
               <w:t>50</w:t>
             </w:r>
             <w:r>
               <w:rPr>
-                <w:sz w:val="16"/>
+                <w:rFonts w:ascii="Times New Roman" w:hAnsi="Times New Roman" w:cs="Times New Roman"/>
+                <w:sz w:val="24"/>
+                <w:szCs w:val="24"/>
               </w:rPr>
               <w:t>0 m (proposed)</w:t>
             </w:r>
@@ -1050,10 +1152,17 @@
           <w:p>
             <w:pPr>
               <w:spacing w:after="40"/>
+              <w:rPr>
+                <w:rFonts w:ascii="Times New Roman" w:hAnsi="Times New Roman" w:cs="Times New Roman"/>
+                <w:sz w:val="24"/>
+                <w:szCs w:val="24"/>
+              </w:rPr>
             </w:pPr>
             <w:r>
               <w:rPr>
-                <w:sz w:val="16"/>
+                <w:rFonts w:ascii="Times New Roman" w:hAnsi="Times New Roman" w:cs="Times New Roman"/>
+                <w:sz w:val="24"/>
+                <w:szCs w:val="24"/>
               </w:rPr>
               <w:t>Requirement – completed control assemblies available for integrated testing</w:t>
             </w:r>
@@ -1067,12 +1176,27 @@
           <w:p>
             <w:pPr>
               <w:spacing w:after="40"/>
+              <w:rPr>
+                <w:rFonts w:ascii="Times New Roman" w:hAnsi="Times New Roman" w:cs="Times New Roman"/>
+                <w:sz w:val="24"/>
+                <w:szCs w:val="24"/>
+              </w:rPr>
             </w:pPr>
             <w:r>
               <w:rPr>
-                <w:sz w:val="16"/>
+                <w:rFonts w:ascii="Times New Roman" w:hAnsi="Times New Roman" w:cs="Times New Roman"/>
+                <w:sz w:val="24"/>
+                <w:szCs w:val="24"/>
               </w:rPr>
-              <w:t>March 15, 2027 (proposed)</w:t>
+              <w:t xml:space="preserve">March 15, </w:t>
+            </w:r>
+            <w:r>
+              <w:rPr>
+                <w:rFonts w:ascii="Times New Roman" w:hAnsi="Times New Roman" w:cs="Times New Roman"/>
+                <w:sz w:val="24"/>
+                <w:szCs w:val="24"/>
+              </w:rPr>
+              <w:t>2027</w:t>
             </w:r>
           </w:p>
         </w:tc>
@@ -1084,12 +1208,19 @@
           <w:p>
             <w:pPr>
               <w:spacing w:after="40"/>
+              <w:rPr>
+                <w:rFonts w:ascii="Times New Roman" w:hAnsi="Times New Roman" w:cs="Times New Roman"/>
+                <w:sz w:val="24"/>
+                <w:szCs w:val="24"/>
+              </w:rPr>
             </w:pPr>
             <w:r>
               <w:rPr>
-                <w:sz w:val="16"/>
+                <w:rFonts w:ascii="Times New Roman" w:hAnsi="Times New Roman" w:cs="Times New Roman"/>
+                <w:sz w:val="24"/>
+                <w:szCs w:val="24"/>
               </w:rPr>
-              <w:t>March 31, 2027 (proposed)</w:t>
+              <w:t>March 31, 2027</w:t>
             </w:r>
           </w:p>
         </w:tc>
@@ -1107,22 +1238,33 @@
           <w:p>
             <w:pPr>
               <w:spacing w:after="40"/>
+              <w:rPr>
+                <w:rFonts w:ascii="Times New Roman" w:hAnsi="Times New Roman" w:cs="Times New Roman"/>
+                <w:sz w:val="24"/>
+                <w:szCs w:val="24"/>
+              </w:rPr>
             </w:pPr>
             <w:r>
               <w:rPr>
-                <w:sz w:val="16"/>
+                <w:rFonts w:ascii="Times New Roman" w:hAnsi="Times New Roman" w:cs="Times New Roman"/>
+                <w:sz w:val="24"/>
+                <w:szCs w:val="24"/>
               </w:rPr>
               <w:t xml:space="preserve">Goal – total installed mass </w:t>
             </w:r>
             <w:r>
               <w:rPr>
-                <w:sz w:val="16"/>
+                <w:rFonts w:ascii="Times New Roman" w:hAnsi="Times New Roman" w:cs="Times New Roman"/>
+                <w:sz w:val="24"/>
+                <w:szCs w:val="24"/>
               </w:rPr>
               <w:t xml:space="preserve">reduction </w:t>
             </w:r>
             <w:r>
               <w:rPr>
-                <w:sz w:val="16"/>
+                <w:rFonts w:ascii="Times New Roman" w:hAnsi="Times New Roman" w:cs="Times New Roman"/>
+                <w:sz w:val="24"/>
+                <w:szCs w:val="24"/>
               </w:rPr>
               <w:t>of redesigned driver-control assemblies</w:t>
             </w:r>
@@ -1137,18 +1279,27 @@
           <w:p>
             <w:pPr>
               <w:spacing w:after="40"/>
+              <w:rPr>
+                <w:rFonts w:ascii="Times New Roman" w:hAnsi="Times New Roman" w:cs="Times New Roman"/>
+                <w:sz w:val="24"/>
+                <w:szCs w:val="24"/>
+              </w:rPr>
             </w:pPr>
             <w:r>
               <w:rPr>
-                <w:sz w:val="16"/>
+                <w:rFonts w:ascii="Times New Roman" w:hAnsi="Times New Roman" w:cs="Times New Roman"/>
+                <w:sz w:val="24"/>
+                <w:szCs w:val="24"/>
               </w:rPr>
-              <w:t xml:space="preserve">10% </w:t>
+              <w:t>5</w:t>
             </w:r>
             <w:r>
               <w:rPr>
-                <w:sz w:val="16"/>
+                <w:rFonts w:ascii="Times New Roman" w:hAnsi="Times New Roman" w:cs="Times New Roman"/>
+                <w:sz w:val="24"/>
+                <w:szCs w:val="24"/>
               </w:rPr>
-              <w:t>(proposed)</w:t>
+              <w:t>% (proposed)</w:t>
             </w:r>
           </w:p>
         </w:tc>
@@ -1161,12 +1312,19 @@
           <w:p>
             <w:pPr>
               <w:spacing w:after="40"/>
+              <w:rPr>
+                <w:rFonts w:ascii="Times New Roman" w:hAnsi="Times New Roman" w:cs="Times New Roman"/>
+                <w:sz w:val="24"/>
+                <w:szCs w:val="24"/>
+              </w:rPr>
             </w:pPr>
             <w:r>
               <w:rPr>
-                <w:sz w:val="16"/>
+                <w:rFonts w:ascii="Times New Roman" w:hAnsi="Times New Roman" w:cs="Times New Roman"/>
+                <w:sz w:val="24"/>
+                <w:szCs w:val="24"/>
               </w:rPr>
-              <w:t>5%</w:t>
+              <w:t>N/A</w:t>
             </w:r>
           </w:p>
         </w:tc>
@@ -1183,10 +1341,17 @@
           <w:p>
             <w:pPr>
               <w:spacing w:after="40"/>
+              <w:rPr>
+                <w:rFonts w:ascii="Times New Roman" w:hAnsi="Times New Roman" w:cs="Times New Roman"/>
+                <w:sz w:val="24"/>
+                <w:szCs w:val="24"/>
+              </w:rPr>
             </w:pPr>
             <w:r>
               <w:rPr>
-                <w:sz w:val="16"/>
+                <w:rFonts w:ascii="Times New Roman" w:hAnsi="Times New Roman" w:cs="Times New Roman"/>
+                <w:sz w:val="24"/>
+                <w:szCs w:val="24"/>
               </w:rPr>
               <w:t>Goal – total purchased component cost</w:t>
             </w:r>
@@ -1200,22 +1365,33 @@
           <w:p>
             <w:pPr>
               <w:spacing w:after="40"/>
+              <w:rPr>
+                <w:rFonts w:ascii="Times New Roman" w:hAnsi="Times New Roman" w:cs="Times New Roman"/>
+                <w:sz w:val="24"/>
+                <w:szCs w:val="24"/>
+              </w:rPr>
             </w:pPr>
             <w:r>
               <w:rPr>
-                <w:sz w:val="16"/>
+                <w:rFonts w:ascii="Times New Roman" w:hAnsi="Times New Roman" w:cs="Times New Roman"/>
+                <w:sz w:val="24"/>
+                <w:szCs w:val="24"/>
               </w:rPr>
               <w:t>≤ $1,</w:t>
             </w:r>
             <w:r>
               <w:rPr>
-                <w:sz w:val="16"/>
+                <w:rFonts w:ascii="Times New Roman" w:hAnsi="Times New Roman" w:cs="Times New Roman"/>
+                <w:sz w:val="24"/>
+                <w:szCs w:val="24"/>
               </w:rPr>
               <w:t>5</w:t>
             </w:r>
             <w:r>
               <w:rPr>
-                <w:sz w:val="16"/>
+                <w:rFonts w:ascii="Times New Roman" w:hAnsi="Times New Roman" w:cs="Times New Roman"/>
+                <w:sz w:val="24"/>
+                <w:szCs w:val="24"/>
               </w:rPr>
               <w:t>00 (proposed)</w:t>
             </w:r>
@@ -1229,10 +1405,17 @@
           <w:p>
             <w:pPr>
               <w:spacing w:after="40"/>
+              <w:rPr>
+                <w:rFonts w:ascii="Times New Roman" w:hAnsi="Times New Roman" w:cs="Times New Roman"/>
+                <w:sz w:val="24"/>
+                <w:szCs w:val="24"/>
+              </w:rPr>
             </w:pPr>
             <w:r>
               <w:rPr>
-                <w:sz w:val="16"/>
+                <w:rFonts w:ascii="Times New Roman" w:hAnsi="Times New Roman" w:cs="Times New Roman"/>
+                <w:sz w:val="24"/>
+                <w:szCs w:val="24"/>
               </w:rPr>
               <w:t>N/A</w:t>
             </w:r>
@@ -1243,140 +1426,300 @@
     <w:p>
       <w:pPr>
         <w:pStyle w:val="Heading1"/>
+        <w:rPr>
+          <w:rFonts w:ascii="Times New Roman" w:hAnsi="Times New Roman" w:cs="Times New Roman"/>
+          <w:sz w:val="24"/>
+          <w:szCs w:val="24"/>
+        </w:rPr>
       </w:pPr>
       <w:r>
+        <w:rPr>
+          <w:rFonts w:ascii="Times New Roman" w:hAnsi="Times New Roman" w:cs="Times New Roman"/>
+          <w:sz w:val="24"/>
+          <w:szCs w:val="24"/>
+        </w:rPr>
+        <w:lastRenderedPageBreak/>
         <w:t>3. Standards</w:t>
       </w:r>
     </w:p>
     <w:p>
       <w:pPr>
         <w:pStyle w:val="ListBullet"/>
+        <w:rPr>
+          <w:rFonts w:ascii="Times New Roman" w:hAnsi="Times New Roman" w:cs="Times New Roman"/>
+          <w:sz w:val="24"/>
+          <w:szCs w:val="24"/>
+        </w:rPr>
       </w:pPr>
       <w:r>
+        <w:rPr>
+          <w:rFonts w:ascii="Times New Roman" w:hAnsi="Times New Roman" w:cs="Times New Roman"/>
+          <w:sz w:val="24"/>
+          <w:szCs w:val="24"/>
+        </w:rPr>
         <w:t>SAE International, Baja SAE Rules 2027, Revision A (11 September 2026), § B.1.2 — driver ergonomics and reach of cockpit controls.</w:t>
       </w:r>
     </w:p>
     <w:p>
       <w:pPr>
         <w:pStyle w:val="ListBullet"/>
+        <w:rPr>
+          <w:rFonts w:ascii="Times New Roman" w:hAnsi="Times New Roman" w:cs="Times New Roman"/>
+          <w:sz w:val="24"/>
+          <w:szCs w:val="24"/>
+        </w:rPr>
       </w:pPr>
       <w:r>
+        <w:rPr>
+          <w:rFonts w:ascii="Times New Roman" w:hAnsi="Times New Roman" w:cs="Times New Roman"/>
+          <w:sz w:val="24"/>
+          <w:szCs w:val="24"/>
+        </w:rPr>
         <w:t>SAE International, Baja SAE Rules 2027, Revision A, §§ B.7.1–B.7.1.5 — hydraulic brakes, pedal strength, independent circuits, and brake-line routing.</w:t>
       </w:r>
     </w:p>
     <w:p>
       <w:pPr>
         <w:pStyle w:val="ListBullet"/>
+        <w:rPr>
+          <w:rFonts w:ascii="Times New Roman" w:hAnsi="Times New Roman" w:cs="Times New Roman"/>
+          <w:sz w:val="24"/>
+          <w:szCs w:val="24"/>
+        </w:rPr>
       </w:pPr>
       <w:r>
+        <w:rPr>
+          <w:rFonts w:ascii="Times New Roman" w:hAnsi="Times New Roman" w:cs="Times New Roman"/>
+          <w:sz w:val="24"/>
+          <w:szCs w:val="24"/>
+        </w:rPr>
         <w:t>SAE International, Baja SAE Rules 2027, Revision A, §§ B.7.2–B.7.2.4 — mechanical throttle, pedal stop, cable installation, and fail-safe idle return.</w:t>
       </w:r>
     </w:p>
     <w:p>
       <w:pPr>
         <w:pStyle w:val="ListBullet"/>
+        <w:rPr>
+          <w:rFonts w:ascii="Times New Roman" w:hAnsi="Times New Roman" w:cs="Times New Roman"/>
+          <w:sz w:val="24"/>
+          <w:szCs w:val="24"/>
+        </w:rPr>
       </w:pPr>
       <w:r>
+        <w:rPr>
+          <w:rFonts w:ascii="Times New Roman" w:hAnsi="Times New Roman" w:cs="Times New Roman"/>
+          <w:sz w:val="24"/>
+          <w:szCs w:val="24"/>
+        </w:rPr>
         <w:t>SAE International, Baja SAE Rules 2027, Revision A, §§ B.8.2 and B.8.7 — cockpit egress and occupant protection around linkages.</w:t>
       </w:r>
     </w:p>
     <w:p>
       <w:pPr>
         <w:pStyle w:val="ListBullet"/>
+        <w:rPr>
+          <w:rFonts w:ascii="Times New Roman" w:hAnsi="Times New Roman" w:cs="Times New Roman"/>
+          <w:sz w:val="24"/>
+          <w:szCs w:val="24"/>
+        </w:rPr>
       </w:pPr>
       <w:r>
+        <w:rPr>
+          <w:rFonts w:ascii="Times New Roman" w:hAnsi="Times New Roman" w:cs="Times New Roman"/>
+          <w:sz w:val="24"/>
+          <w:szCs w:val="24"/>
+        </w:rPr>
         <w:t>SAE International, Baja SAE Rules 2027, Revision A, §§ B.10.2.1–B.10.2.3 — electrical wiring routing, termination, and connector protection applicable to communications equipment.</w:t>
       </w:r>
     </w:p>
     <w:p>
       <w:pPr>
         <w:pStyle w:val="ListBullet"/>
+        <w:rPr>
+          <w:rFonts w:ascii="Times New Roman" w:hAnsi="Times New Roman" w:cs="Times New Roman"/>
+          <w:sz w:val="24"/>
+          <w:szCs w:val="24"/>
+        </w:rPr>
       </w:pPr>
       <w:r>
+        <w:rPr>
+          <w:rFonts w:ascii="Times New Roman" w:hAnsi="Times New Roman" w:cs="Times New Roman"/>
+          <w:sz w:val="24"/>
+          <w:szCs w:val="24"/>
+        </w:rPr>
         <w:t>SAE International, Baja SAE Rules 2027, Revision A, § B.1.5.2 — optional use of four-wheel/all-wheel drive.</w:t>
-      </w:r>
-    </w:p>
-    <w:p>
-      <w:r>
-        <w:t>The team will verify the latest applicable competition rule revision and official clarifications before releasing designs and attending technical inspection.</w:t>
       </w:r>
     </w:p>
     <w:p>
       <w:pPr>
         <w:pStyle w:val="Heading1"/>
+        <w:rPr>
+          <w:rFonts w:ascii="Times New Roman" w:hAnsi="Times New Roman" w:cs="Times New Roman"/>
+          <w:sz w:val="24"/>
+          <w:szCs w:val="24"/>
+        </w:rPr>
+      </w:pPr>
+    </w:p>
+    <w:p>
+      <w:pPr>
+        <w:pStyle w:val="Heading1"/>
+        <w:rPr>
+          <w:rFonts w:ascii="Times New Roman" w:hAnsi="Times New Roman" w:cs="Times New Roman"/>
+          <w:sz w:val="24"/>
+          <w:szCs w:val="24"/>
+        </w:rPr>
+      </w:pPr>
+    </w:p>
+    <w:p>
+      <w:pPr>
+        <w:pStyle w:val="Heading1"/>
+        <w:rPr>
+          <w:rFonts w:ascii="Times New Roman" w:hAnsi="Times New Roman" w:cs="Times New Roman"/>
+          <w:sz w:val="24"/>
+          <w:szCs w:val="24"/>
+        </w:rPr>
       </w:pPr>
       <w:r>
-        <w:lastRenderedPageBreak/>
+        <w:rPr>
+          <w:rFonts w:ascii="Times New Roman" w:hAnsi="Times New Roman" w:cs="Times New Roman"/>
+          <w:sz w:val="24"/>
+          <w:szCs w:val="24"/>
+        </w:rPr>
         <w:t>4. Deliverables</w:t>
       </w:r>
     </w:p>
     <w:p>
       <w:pPr>
         <w:pStyle w:val="ListBullet"/>
+        <w:rPr>
+          <w:rFonts w:ascii="Times New Roman" w:hAnsi="Times New Roman" w:cs="Times New Roman"/>
+          <w:sz w:val="24"/>
+          <w:szCs w:val="24"/>
+        </w:rPr>
       </w:pPr>
       <w:r>
         <w:rPr>
+          <w:rFonts w:ascii="Times New Roman" w:hAnsi="Times New Roman" w:cs="Times New Roman"/>
           <w:b/>
+          <w:sz w:val="24"/>
+          <w:szCs w:val="24"/>
         </w:rPr>
         <w:t xml:space="preserve">Steering system: </w:t>
       </w:r>
       <w:r>
+        <w:rPr>
+          <w:rFonts w:ascii="Times New Roman" w:hAnsi="Times New Roman" w:cs="Times New Roman"/>
+          <w:sz w:val="24"/>
+          <w:szCs w:val="24"/>
+        </w:rPr>
         <w:t>Completed and installed steering-wheel-to-rack controls, including mechanical interfaces, supports, adjustments, and demonstrated steering function.</w:t>
       </w:r>
     </w:p>
     <w:p>
       <w:pPr>
         <w:pStyle w:val="ListBullet"/>
+        <w:rPr>
+          <w:rFonts w:ascii="Times New Roman" w:hAnsi="Times New Roman" w:cs="Times New Roman"/>
+          <w:sz w:val="24"/>
+          <w:szCs w:val="24"/>
+        </w:rPr>
       </w:pPr>
       <w:r>
         <w:rPr>
+          <w:rFonts w:ascii="Times New Roman" w:hAnsi="Times New Roman" w:cs="Times New Roman"/>
           <w:b/>
+          <w:sz w:val="24"/>
+          <w:szCs w:val="24"/>
         </w:rPr>
         <w:t xml:space="preserve">Throttle system: </w:t>
       </w:r>
       <w:r>
+        <w:rPr>
+          <w:rFonts w:ascii="Times New Roman" w:hAnsi="Times New Roman" w:cs="Times New Roman"/>
+          <w:sz w:val="24"/>
+          <w:szCs w:val="24"/>
+        </w:rPr>
         <w:t>Installed mechanical pedal-to-engine throttle actuation with positive pedal stop, protected cable routing, full throttle travel, and documented fail-safe idle return.</w:t>
       </w:r>
     </w:p>
     <w:p>
       <w:pPr>
         <w:pStyle w:val="ListBullet"/>
+        <w:rPr>
+          <w:rFonts w:ascii="Times New Roman" w:hAnsi="Times New Roman" w:cs="Times New Roman"/>
+          <w:sz w:val="24"/>
+          <w:szCs w:val="24"/>
+        </w:rPr>
       </w:pPr>
       <w:r>
         <w:rPr>
+          <w:rFonts w:ascii="Times New Roman" w:hAnsi="Times New Roman" w:cs="Times New Roman"/>
           <w:b/>
+          <w:sz w:val="24"/>
+          <w:szCs w:val="24"/>
         </w:rPr>
         <w:t xml:space="preserve">Braking system: </w:t>
       </w:r>
       <w:r>
+        <w:rPr>
+          <w:rFonts w:ascii="Times New Roman" w:hAnsi="Times New Roman" w:cs="Times New Roman"/>
+          <w:sz w:val="24"/>
+          <w:szCs w:val="24"/>
+        </w:rPr>
         <w:t>Installed pedal-to-caliper hydraulic braking system with independent circuits, supported lines, adequate pedal travel, and documented brake function and pedal strength.</w:t>
       </w:r>
     </w:p>
     <w:p>
       <w:pPr>
         <w:pStyle w:val="ListBullet"/>
+        <w:rPr>
+          <w:rFonts w:ascii="Times New Roman" w:hAnsi="Times New Roman" w:cs="Times New Roman"/>
+          <w:sz w:val="24"/>
+          <w:szCs w:val="24"/>
+        </w:rPr>
       </w:pPr>
       <w:r>
         <w:rPr>
+          <w:rFonts w:ascii="Times New Roman" w:hAnsi="Times New Roman" w:cs="Times New Roman"/>
           <w:b/>
+          <w:sz w:val="24"/>
+          <w:szCs w:val="24"/>
         </w:rPr>
         <w:t xml:space="preserve">4WD engagement system: </w:t>
       </w:r>
       <w:r>
+        <w:rPr>
+          <w:rFonts w:ascii="Times New Roman" w:hAnsi="Times New Roman" w:cs="Times New Roman"/>
+          <w:sz w:val="24"/>
+          <w:szCs w:val="24"/>
+        </w:rPr>
         <w:t>Installed driver-operated engagement controls through the 4WD engagement box, with accessible operation and verified engagement/disengagement.</w:t>
       </w:r>
     </w:p>
     <w:p>
       <w:pPr>
         <w:pStyle w:val="ListBullet"/>
+        <w:rPr>
+          <w:rFonts w:ascii="Times New Roman" w:hAnsi="Times New Roman" w:cs="Times New Roman"/>
+          <w:sz w:val="24"/>
+          <w:szCs w:val="24"/>
+        </w:rPr>
       </w:pPr>
       <w:r>
         <w:rPr>
+          <w:rFonts w:ascii="Times New Roman" w:hAnsi="Times New Roman" w:cs="Times New Roman"/>
           <w:b/>
+          <w:sz w:val="24"/>
+          <w:szCs w:val="24"/>
         </w:rPr>
         <w:t xml:space="preserve">Driver-to-pit communications: </w:t>
       </w:r>
       <w:r>
+        <w:rPr>
+          <w:rFonts w:ascii="Times New Roman" w:hAnsi="Times New Roman" w:cs="Times New Roman"/>
+          <w:sz w:val="24"/>
+          <w:szCs w:val="24"/>
+        </w:rPr>
         <w:t>Installed communication system and driver interface, including mounting, wiring, and verified operation at the sponsor-approved range.</w:t>
       </w:r>
     </w:p>
@@ -1388,22 +1731,40 @@
           <w:numId w:val="0"/>
         </w:numPr>
         <w:ind w:left="360"/>
+        <w:rPr>
+          <w:rFonts w:ascii="Times New Roman" w:hAnsi="Times New Roman" w:cs="Times New Roman"/>
+          <w:sz w:val="24"/>
+          <w:szCs w:val="24"/>
+        </w:rPr>
       </w:pPr>
       <w:r>
         <w:rPr>
+          <w:rFonts w:ascii="Times New Roman" w:hAnsi="Times New Roman" w:cs="Times New Roman"/>
           <w:b/>
+          <w:sz w:val="24"/>
+          <w:szCs w:val="24"/>
         </w:rPr>
         <w:t xml:space="preserve">Technical handoff package: </w:t>
       </w:r>
       <w:r>
+        <w:rPr>
+          <w:rFonts w:ascii="Times New Roman" w:hAnsi="Times New Roman" w:cs="Times New Roman"/>
+          <w:sz w:val="24"/>
+          <w:szCs w:val="24"/>
+        </w:rPr>
         <w:t>Final CAD models and drawings, complete bill of materials, component specifications, installation/service instructions, rule-compliance checklist, and measurements from functional and durability testing for the five systems.</w:t>
       </w:r>
       <w:r>
+        <w:rPr>
+          <w:rFonts w:ascii="Times New Roman" w:hAnsi="Times New Roman" w:cs="Times New Roman"/>
+          <w:sz w:val="24"/>
+          <w:szCs w:val="24"/>
+        </w:rPr>
         <w:t xml:space="preserve"> Including a poster with design process used, for use at senior design night. </w:t>
       </w:r>
     </w:p>
     <w:sectPr>
-      <w:footerReference w:type="default" r:id="rId8"/>
+      <w:footerReference w:type="default" r:id="rId11"/>
       <w:pgSz w:w="12240" w:h="15840"/>
       <w:pgMar w:top="1123" w:right="1224" w:bottom="1008" w:left="1224" w:header="720" w:footer="720" w:gutter="0"/>
       <w:cols w:space="720"/>
@@ -2290,7 +2651,6 @@
   <w:style w:type="character" w:default="1" w:styleId="DefaultParagraphFont">
     <w:name w:val="Default Paragraph Font"/>
     <w:uiPriority w:val="1"/>
-    <w:semiHidden/>
     <w:unhideWhenUsed/>
   </w:style>
   <w:style w:type="table" w:default="1" w:styleId="TableNormal">
@@ -13066,6 +13426,29 @@
         <w:shd w:val="clear" w:color="auto" w:fill="FBCAA2" w:themeFill="accent6" w:themeFillTint="7F"/>
       </w:tcPr>
     </w:tblStylePr>
+  </w:style>
+  <w:style w:type="character" w:styleId="Hyperlink">
+    <w:name w:val="Hyperlink"/>
+    <w:basedOn w:val="DefaultParagraphFont"/>
+    <w:uiPriority w:val="99"/>
+    <w:unhideWhenUsed/>
+    <w:rsid w:val="00744366"/>
+    <w:rPr>
+      <w:color w:val="0000FF" w:themeColor="hyperlink"/>
+      <w:u w:val="single"/>
+    </w:rPr>
+  </w:style>
+  <w:style w:type="character" w:styleId="UnresolvedMention">
+    <w:name w:val="Unresolved Mention"/>
+    <w:basedOn w:val="DefaultParagraphFont"/>
+    <w:uiPriority w:val="99"/>
+    <w:semiHidden/>
+    <w:unhideWhenUsed/>
+    <w:rsid w:val="00744366"/>
+    <w:rPr>
+      <w:color w:val="605E5C"/>
+      <w:shd w:val="clear" w:color="auto" w:fill="E1DFDD"/>
+    </w:rPr>
   </w:style>
 </w:styles>
 </file>

</xml_diff>

<commit_message>
Update statement of work
This commit updates the Statement of Work document to reflect the latest project details, scope, and requirements.
</commit_message>
<xml_diff>
--- a/Statement of work.docx
+++ b/Statement of work.docx
@@ -272,16 +272,6 @@
     </w:p>
     <w:p>
       <w:pPr>
-        <w:jc w:val="center"/>
-        <w:rPr>
-          <w:rFonts w:ascii="Times New Roman" w:hAnsi="Times New Roman" w:cs="Times New Roman"/>
-          <w:sz w:val="24"/>
-          <w:szCs w:val="24"/>
-        </w:rPr>
-      </w:pPr>
-    </w:p>
-    <w:p>
-      <w:pPr>
         <w:pStyle w:val="Heading1"/>
         <w:rPr>
           <w:rFonts w:ascii="Times New Roman" w:hAnsi="Times New Roman" w:cs="Times New Roman"/>
@@ -295,6 +285,7 @@
           <w:sz w:val="24"/>
           <w:szCs w:val="24"/>
         </w:rPr>
+        <w:lastRenderedPageBreak/>
         <w:t>1. Problem Description</w:t>
       </w:r>
     </w:p>
@@ -527,7 +518,7 @@
                 <w:sz w:val="24"/>
                 <w:szCs w:val="24"/>
               </w:rPr>
-              <w:t>≥ 2,500 N (proposed)</w:t>
+              <w:t>≥ 2,500 N</w:t>
             </w:r>
           </w:p>
         </w:tc>
@@ -920,7 +911,7 @@
                 <w:sz w:val="24"/>
                 <w:szCs w:val="24"/>
               </w:rPr>
-              <w:t>≤ 4 s (proposed)</w:t>
+              <w:t xml:space="preserve">≤ 4 s </w:t>
             </w:r>
           </w:p>
         </w:tc>
@@ -974,7 +965,7 @@
                 <w:sz w:val="24"/>
                 <w:szCs w:val="24"/>
               </w:rPr>
-              <w:t>Requirement – steering wheel free play</w:t>
+              <w:t>Requirement – steering wheel rotational free play before rack motion</w:t>
             </w:r>
           </w:p>
         </w:tc>
@@ -998,7 +989,7 @@
                 <w:sz w:val="24"/>
                 <w:szCs w:val="24"/>
               </w:rPr>
-              <w:t>≤ 5 mm (proposed)</w:t>
+              <w:t xml:space="preserve">≤ 2° </w:t>
             </w:r>
           </w:p>
         </w:tc>
@@ -1022,7 +1013,7 @@
                 <w:sz w:val="24"/>
                 <w:szCs w:val="24"/>
               </w:rPr>
-              <w:t>≤ 10 mm (proposed)</w:t>
+              <w:t xml:space="preserve">≤ 5° </w:t>
             </w:r>
           </w:p>
         </w:tc>
@@ -1093,7 +1084,7 @@
                 <w:sz w:val="24"/>
                 <w:szCs w:val="24"/>
               </w:rPr>
-              <w:t>0 m (proposed)</w:t>
+              <w:t>0 m</w:t>
             </w:r>
           </w:p>
         </w:tc>
@@ -1134,7 +1125,7 @@
                 <w:sz w:val="24"/>
                 <w:szCs w:val="24"/>
               </w:rPr>
-              <w:t>0 m (proposed)</w:t>
+              <w:t>0 m</w:t>
             </w:r>
           </w:p>
         </w:tc>
@@ -1227,6 +1218,124 @@
       </w:tr>
       <w:tr>
         <w:trPr>
+          <w:trHeight w:val="350"/>
+          <w:jc w:val="center"/>
+        </w:trPr>
+        <w:tc>
+          <w:tcPr>
+            <w:tcW w:w="5184" w:type="dxa"/>
+            <w:vAlign w:val="center"/>
+          </w:tcPr>
+          <w:p>
+            <w:pPr>
+              <w:spacing w:after="40"/>
+              <w:rPr>
+                <w:rFonts w:ascii="Times New Roman" w:hAnsi="Times New Roman" w:cs="Times New Roman"/>
+                <w:sz w:val="24"/>
+                <w:szCs w:val="24"/>
+              </w:rPr>
+            </w:pPr>
+            <w:r>
+              <w:rPr>
+                <w:rFonts w:ascii="Times New Roman" w:hAnsi="Times New Roman" w:cs="Times New Roman"/>
+                <w:sz w:val="24"/>
+                <w:szCs w:val="24"/>
+              </w:rPr>
+              <w:t xml:space="preserve">Requirement </w:t>
+            </w:r>
+            <w:r>
+              <w:rPr>
+                <w:rFonts w:ascii="Times New Roman" w:hAnsi="Times New Roman" w:cs="Times New Roman"/>
+                <w:sz w:val="24"/>
+                <w:szCs w:val="24"/>
+              </w:rPr>
+              <w:t>–</w:t>
+            </w:r>
+            <w:r>
+              <w:rPr>
+                <w:rFonts w:ascii="Times New Roman" w:hAnsi="Times New Roman" w:cs="Times New Roman"/>
+                <w:sz w:val="24"/>
+                <w:szCs w:val="24"/>
+              </w:rPr>
+              <w:t xml:space="preserve"> </w:t>
+            </w:r>
+            <w:r>
+              <w:rPr>
+                <w:rFonts w:ascii="Times New Roman" w:hAnsi="Times New Roman" w:cs="Times New Roman"/>
+                <w:sz w:val="24"/>
+                <w:szCs w:val="24"/>
+              </w:rPr>
+              <w:t>r</w:t>
+            </w:r>
+            <w:r>
+              <w:rPr>
+                <w:rFonts w:ascii="Times New Roman" w:hAnsi="Times New Roman" w:cs="Times New Roman"/>
+                <w:sz w:val="24"/>
+                <w:szCs w:val="24"/>
+              </w:rPr>
+              <w:t>adio and battery shock resistance</w:t>
+            </w:r>
+          </w:p>
+        </w:tc>
+        <w:tc>
+          <w:tcPr>
+            <w:tcW w:w="2333" w:type="dxa"/>
+            <w:vAlign w:val="center"/>
+          </w:tcPr>
+          <w:p>
+            <w:pPr>
+              <w:spacing w:after="40"/>
+              <w:rPr>
+                <w:rFonts w:ascii="Times New Roman" w:hAnsi="Times New Roman" w:cs="Times New Roman"/>
+                <w:sz w:val="24"/>
+                <w:szCs w:val="24"/>
+              </w:rPr>
+            </w:pPr>
+            <w:r>
+              <w:rPr>
+                <w:rFonts w:ascii="Times New Roman" w:hAnsi="Times New Roman" w:cs="Times New Roman"/>
+                <w:sz w:val="24"/>
+                <w:szCs w:val="24"/>
+              </w:rPr>
+              <w:t>15 g</w:t>
+            </w:r>
+            <w:r>
+              <w:rPr>
+                <w:rFonts w:ascii="Times New Roman" w:hAnsi="Times New Roman" w:cs="Times New Roman"/>
+                <w:sz w:val="24"/>
+                <w:szCs w:val="24"/>
+              </w:rPr>
+              <w:t>’s</w:t>
+            </w:r>
+          </w:p>
+        </w:tc>
+        <w:tc>
+          <w:tcPr>
+            <w:tcW w:w="2333" w:type="dxa"/>
+            <w:vAlign w:val="center"/>
+          </w:tcPr>
+          <w:p>
+            <w:pPr>
+              <w:spacing w:after="40"/>
+              <w:rPr>
+                <w:rFonts w:ascii="Times New Roman" w:hAnsi="Times New Roman" w:cs="Times New Roman"/>
+                <w:sz w:val="24"/>
+                <w:szCs w:val="24"/>
+              </w:rPr>
+            </w:pPr>
+            <w:r>
+              <w:rPr>
+                <w:rFonts w:ascii="Times New Roman" w:hAnsi="Times New Roman" w:cs="Times New Roman"/>
+                <w:sz w:val="24"/>
+                <w:szCs w:val="24"/>
+              </w:rPr>
+              <w:t>10 g’s</w:t>
+            </w:r>
+          </w:p>
+        </w:tc>
+      </w:tr>
+      <w:tr>
+        <w:trPr>
           <w:jc w:val="center"/>
         </w:trPr>
         <w:tc>
@@ -1291,15 +1400,7 @@
                 <w:sz w:val="24"/>
                 <w:szCs w:val="24"/>
               </w:rPr>
-              <w:t>5</w:t>
-            </w:r>
-            <w:r>
-              <w:rPr>
-                <w:rFonts w:ascii="Times New Roman" w:hAnsi="Times New Roman" w:cs="Times New Roman"/>
-                <w:sz w:val="24"/>
-                <w:szCs w:val="24"/>
-              </w:rPr>
-              <w:t>% (proposed)</w:t>
+              <w:t>15%</w:t>
             </w:r>
           </w:p>
         </w:tc>
@@ -1393,7 +1494,7 @@
                 <w:sz w:val="24"/>
                 <w:szCs w:val="24"/>
               </w:rPr>
-              <w:t>00 (proposed)</w:t>
+              <w:t xml:space="preserve">00 </w:t>
             </w:r>
           </w:p>
         </w:tc>

</xml_diff>